<commit_message>
Fix supervisor dashboard student list loading and persist active student state to disk
</commit_message>
<xml_diff>
--- a/soal matematika/Kelas XII/Materi Transformasi Geometri/Kunci Jawaban Pilihan Ganda Kelas XII.docx
+++ b/soal matematika/Kelas XII/Materi Transformasi Geometri/Kunci Jawaban Pilihan Ganda Kelas XII.docx
@@ -11,7 +11,7 @@
         </w:numPr>
       </w:pPr>
       <w:r>
-        <w:t>A</w:t>
+        <w:t>a</w:t>
       </w:r>
     </w:p>
     <w:p>
@@ -23,7 +23,7 @@
         </w:numPr>
       </w:pPr>
       <w:r>
-        <w:t>A</w:t>
+        <w:t>a</w:t>
       </w:r>
     </w:p>
     <w:p>
@@ -35,7 +35,7 @@
         </w:numPr>
       </w:pPr>
       <w:r>
-        <w:t>B</w:t>
+        <w:t>a</w:t>
       </w:r>
     </w:p>
     <w:p>
@@ -47,7 +47,7 @@
         </w:numPr>
       </w:pPr>
       <w:r>
-        <w:t>A</w:t>
+        <w:t>a</w:t>
       </w:r>
     </w:p>
     <w:p>
@@ -59,7 +59,7 @@
         </w:numPr>
       </w:pPr>
       <w:r>
-        <w:t>A</w:t>
+        <w:t>a</w:t>
       </w:r>
     </w:p>
     <w:p>
@@ -71,7 +71,7 @@
         </w:numPr>
       </w:pPr>
       <w:r>
-        <w:t>C</w:t>
+        <w:t>c</w:t>
       </w:r>
     </w:p>
     <w:p>
@@ -83,7 +83,7 @@
         </w:numPr>
       </w:pPr>
       <w:r>
-        <w:t>A</w:t>
+        <w:t>a</w:t>
       </w:r>
     </w:p>
     <w:p>
@@ -95,7 +95,7 @@
         </w:numPr>
       </w:pPr>
       <w:r>
-        <w:t>D</w:t>
+        <w:t>d</w:t>
       </w:r>
     </w:p>
     <w:p>
@@ -107,7 +107,7 @@
         </w:numPr>
       </w:pPr>
       <w:r>
-        <w:t>B</w:t>
+        <w:t>b</w:t>
       </w:r>
     </w:p>
     <w:p>
@@ -119,7 +119,7 @@
         </w:numPr>
       </w:pPr>
       <w:r>
-        <w:t>A</w:t>
+        <w:t>a</w:t>
       </w:r>
     </w:p>
     <w:sectPr>

</xml_diff>